<commit_message>
Update dimension table docs and add table profiling script
Expanded join path summaries and table lists in dimension_table_columns.sql, updated the ER diagram document, and added a new tableprofile.sql script to profile schema, table, column, and key relationships for key tables.
</commit_message>
<xml_diff>
--- a/sharif/dimension_tables_er.docx
+++ b/sharif/dimension_tables_er.docx
@@ -33,9 +33,9 @@
         </w:rPr>
         <w:drawing>
           <wp:inline distT="0" distB="0" distL="0" distR="0">
-            <wp:extent cx="5731510" cy="3260262"/>
+            <wp:extent cx="5731510" cy="3147798"/>
             <wp:effectExtent l="0" t="0" r="2540" b="0"/>
-            <wp:docPr id="5" name="Picture 5"/>
+            <wp:docPr id="1" name="Picture 1"/>
             <wp:cNvGraphicFramePr>
               <a:graphicFrameLocks xmlns:a="http://schemas.openxmlformats.org/drawingml/2006/main" noChangeAspect="1"/>
             </wp:cNvGraphicFramePr>
@@ -43,7 +43,7 @@
               <a:graphicData uri="http://schemas.openxmlformats.org/drawingml/2006/picture">
                 <pic:pic xmlns:pic="http://schemas.openxmlformats.org/drawingml/2006/picture">
                   <pic:nvPicPr>
-                    <pic:cNvPr id="0" name="Picture 5"/>
+                    <pic:cNvPr id="0" name="Picture 1"/>
                     <pic:cNvPicPr>
                       <a:picLocks noChangeAspect="1" noChangeArrowheads="1"/>
                     </pic:cNvPicPr>
@@ -64,7 +64,7 @@
                   <pic:spPr bwMode="auto">
                     <a:xfrm>
                       <a:off x="0" y="0"/>
-                      <a:ext cx="5731510" cy="3260262"/>
+                      <a:ext cx="5731510" cy="3147798"/>
                     </a:xfrm>
                     <a:prstGeom prst="rect">
                       <a:avLst/>
@@ -84,16 +84,6 @@
     <w:p>
       <w:pPr>
         <w:pStyle w:val="ListParagraph"/>
-      </w:pPr>
-    </w:p>
-    <w:p>
-      <w:pPr>
-        <w:pStyle w:val="ListParagraph"/>
-      </w:pPr>
-    </w:p>
-    <w:p>
-      <w:pPr>
-        <w:pStyle w:val="ListParagraph"/>
         <w:numPr>
           <w:ilvl w:val="0"/>
           <w:numId w:val="1"/>
@@ -102,6 +92,8 @@
           <w:b/>
         </w:rPr>
       </w:pPr>
+      <w:bookmarkStart w:id="0" w:name="_GoBack"/>
+      <w:bookmarkEnd w:id="0"/>
       <w:r>
         <w:rPr>
           <w:b/>
@@ -230,7 +222,6 @@
       <w:pPr>
         <w:pStyle w:val="ListParagraph"/>
       </w:pPr>
-      <w:bookmarkStart w:id="0" w:name="_GoBack"/>
       <w:r>
         <w:rPr>
           <w:noProof/>
@@ -285,7 +276,6 @@
           </wp:inline>
         </w:drawing>
       </w:r>
-      <w:bookmarkEnd w:id="0"/>
     </w:p>
     <w:p/>
     <w:p>

</xml_diff>